<commit_message>
style: go bo thanh nut loc trang thai, cot trang thai don va cum nut header theo yeu cau
</commit_message>
<xml_diff>
--- a/push githup khi có nhiều tài khoản.docx
+++ b/push githup khi có nhiều tài khoản.docx
@@ -62,8 +62,58 @@
           <w:sz w:val="32"/>
           <w:szCs w:val="32"/>
         </w:rPr>
-        <w:t>- gg drive: lythanhluan2021@gmail.com</w:t>
-      </w:r>
+        <w:t xml:space="preserve">- gg drive: </w:t>
+      </w:r>
+      <w:hyperlink r:id="rId5" w:history="1">
+        <w:r>
+          <w:rPr>
+            <w:rStyle w:val="Hyperlink"/>
+            <w:rFonts w:ascii="Times New Roman" w:hAnsi="Times New Roman" w:cs="Times New Roman"/>
+            <w:sz w:val="32"/>
+            <w:szCs w:val="32"/>
+          </w:rPr>
+          <w:t>lythanhluan2021@gmail.com</w:t>
+        </w:r>
+      </w:hyperlink>
+    </w:p>
+    <w:p>
+      <w:pPr>
+        <w:spacing w:after="0" w:line="240" w:lineRule="auto"/>
+        <w:rPr>
+          <w:rFonts w:ascii="Times New Roman" w:hAnsi="Times New Roman" w:cs="Times New Roman"/>
+          <w:sz w:val="32"/>
+          <w:szCs w:val="32"/>
+        </w:rPr>
+      </w:pPr>
+      <w:r>
+        <w:rPr>
+          <w:rFonts w:ascii="Times New Roman" w:hAnsi="Times New Roman" w:cs="Times New Roman"/>
+          <w:sz w:val="32"/>
+          <w:szCs w:val="32"/>
+        </w:rPr>
+        <w:t xml:space="preserve">-scrip: </w:t>
+      </w:r>
+      <w:hyperlink r:id="rId6" w:history="1">
+        <w:r>
+          <w:rPr>
+            <w:rStyle w:val="Hyperlink"/>
+            <w:rFonts w:ascii="Times New Roman" w:hAnsi="Times New Roman" w:cs="Times New Roman"/>
+            <w:sz w:val="32"/>
+            <w:szCs w:val="32"/>
+          </w:rPr>
+          <w:t>https://script.google.com/macros/s/AKfycbxDY3_avCD1wEOKb0eOQd7C8GeF-33JF9PvnSIkpUm44yJG2phdVRZOXCyfX_ONVGQG/exec</w:t>
+        </w:r>
+      </w:hyperlink>
+    </w:p>
+    <w:p>
+      <w:pPr>
+        <w:spacing w:after="0" w:line="240" w:lineRule="auto"/>
+        <w:rPr>
+          <w:rFonts w:ascii="Times New Roman" w:hAnsi="Times New Roman" w:cs="Times New Roman"/>
+          <w:sz w:val="32"/>
+          <w:szCs w:val="32"/>
+        </w:rPr>
+      </w:pPr>
     </w:p>
     <w:p>
       <w:pPr>
@@ -513,8 +563,17 @@
           <w:rFonts w:ascii="Times New Roman" w:hAnsi="Times New Roman" w:cs="Times New Roman"/>
           <w:sz w:val="32"/>
           <w:szCs w:val="32"/>
-        </w:rPr>
-        <w:t>Bước 1: Vào Cài đặt Dự án trên Vercel</w:t>
+          <w:highlight w:val="yellow"/>
+        </w:rPr>
+        <w:t>Bước 1</w:t>
+      </w:r>
+      <w:r>
+        <w:rPr>
+          <w:rFonts w:ascii="Times New Roman" w:hAnsi="Times New Roman" w:cs="Times New Roman"/>
+          <w:sz w:val="32"/>
+          <w:szCs w:val="32"/>
+        </w:rPr>
+        <w:t>: Vào Cài đặt Dự án trên Vercel</w:t>
       </w:r>
     </w:p>
     <w:p>
@@ -585,8 +644,17 @@
           <w:rFonts w:ascii="Times New Roman" w:hAnsi="Times New Roman" w:cs="Times New Roman"/>
           <w:sz w:val="32"/>
           <w:szCs w:val="32"/>
-        </w:rPr>
-        <w:t>Bước 2: Đổi tên miền miễn phí của Vercel</w:t>
+          <w:highlight w:val="yellow"/>
+        </w:rPr>
+        <w:t>Bước 2:</w:t>
+      </w:r>
+      <w:r>
+        <w:rPr>
+          <w:rFonts w:ascii="Times New Roman" w:hAnsi="Times New Roman" w:cs="Times New Roman"/>
+          <w:sz w:val="32"/>
+          <w:szCs w:val="32"/>
+        </w:rPr>
+        <w:t xml:space="preserve"> Đổi tên miền miễn phí của Vercel</w:t>
       </w:r>
     </w:p>
     <w:p>

</xml_diff>

<commit_message>
feat: he thong luu tru song song CSDL Excel may tinh (CSDL_PHOTO_LOCAL.xlsx) va Google Sheets, offline 100%, nut mo file Excel truc tiep
</commit_message>
<xml_diff>
--- a/push githup khi có nhiều tài khoản.docx
+++ b/push githup khi có nhiều tài khoản.docx
@@ -50,11 +50,6 @@
     <w:p>
       <w:pPr>
         <w:spacing w:after="0" w:line="240" w:lineRule="auto"/>
-        <w:rPr>
-          <w:rFonts w:ascii="Times New Roman" w:hAnsi="Times New Roman" w:cs="Times New Roman"/>
-          <w:sz w:val="32"/>
-          <w:szCs w:val="32"/>
-        </w:rPr>
       </w:pPr>
       <w:r>
         <w:rPr>
@@ -86,6 +81,22 @@
         </w:rPr>
       </w:pPr>
       <w:r>
+        <w:t xml:space="preserve">-Apps Scrips: </w:t>
+      </w:r>
+      <w:r>
+        <w:t>https://script.google.com/u/1/home/projects/1XGYAzf8VWlumrsbiznD4IqYRLg1N8zB3ZaQdLgn2p6gfEoZtQnoVBPid/edit?pageId=none</w:t>
+      </w:r>
+    </w:p>
+    <w:p>
+      <w:pPr>
+        <w:spacing w:after="0" w:line="240" w:lineRule="auto"/>
+        <w:rPr>
+          <w:rFonts w:ascii="Times New Roman" w:hAnsi="Times New Roman" w:cs="Times New Roman"/>
+          <w:sz w:val="32"/>
+          <w:szCs w:val="32"/>
+        </w:rPr>
+      </w:pPr>
+      <w:r>
         <w:rPr>
           <w:rFonts w:ascii="Times New Roman" w:hAnsi="Times New Roman" w:cs="Times New Roman"/>
           <w:sz w:val="32"/>
@@ -114,6 +125,22 @@
           <w:szCs w:val="32"/>
         </w:rPr>
       </w:pPr>
+      <w:r>
+        <w:rPr>
+          <w:rFonts w:ascii="Times New Roman" w:hAnsi="Times New Roman" w:cs="Times New Roman"/>
+          <w:sz w:val="32"/>
+          <w:szCs w:val="32"/>
+        </w:rPr>
+        <w:t xml:space="preserve">- </w:t>
+      </w:r>
+      <w:r>
+        <w:rPr>
+          <w:rFonts w:ascii="Times New Roman" w:hAnsi="Times New Roman" w:cs="Times New Roman"/>
+          <w:sz w:val="32"/>
+          <w:szCs w:val="32"/>
+        </w:rPr>
+        <w:t>https://vercel.com/quanly-file/tinh-tien-pho-to2026</w:t>
+      </w:r>
     </w:p>
     <w:p>
       <w:pPr>

</xml_diff>